<commit_message>
fix: samakan dokumen perjalanan dinas dengan master
</commit_message>
<xml_diff>
--- a/legacy/sips_app/resources/templates/surat_izin_pendamping_asn.docx
+++ b/legacy/sips_app/resources/templates/surat_izin_pendamping_asn.docx
@@ -105,14 +105,10 @@
                 <w:lang w:val="es-ES"/>
               </w:rPr>
             </w:pPr>
-            <w:proofErr w:type="spellStart"/>
-            <w:proofErr w:type="spellEnd"/>
             <w:r>
               <w:rPr>
                 <w:rFonts w:ascii="Arial" w:hAnsi="Arial"/>
-                <w:b w:val="0"/>
                 <w:sz w:val="24"/>
-                <w:u w:val="none"/>
               </w:rPr>
               <w:t>Bitung, {{tanggal_surat_asn}}</w:t>
             </w:r>
@@ -264,22 +260,6 @@
                 <w:sz w:val="24"/>
               </w:rPr>
               <w:t>{{nomor_izin_pendamping}}</w:t>
-            </w:r>
-            <w:proofErr w:type="spellStart"/>
-            <w:r>
-              <w:rPr>
-                <w:rFonts w:ascii="Arial" w:hAnsi="Arial" w:cs="Arial"/>
-                <w:sz w:val="24"/>
-              </w:rPr>
-              <w:t/>
-            </w:r>
-            <w:proofErr w:type="spellEnd"/>
-            <w:r>
-              <w:rPr>
-                <w:rFonts w:ascii="Arial" w:hAnsi="Arial" w:cs="Arial"/>
-                <w:sz w:val="24"/>
-              </w:rPr>
-              <w:t/>
             </w:r>
           </w:p>
         </w:tc>
@@ -618,8 +598,8 @@
         <w:tblLook w:val="04A0" w:firstRow="1" w:lastRow="0" w:firstColumn="1" w:lastColumn="0" w:noHBand="0" w:noVBand="1"/>
       </w:tblPr>
       <w:tblGrid>
-        <w:gridCol w:w="850"/>
-        <w:gridCol w:w="9635"/>
+        <w:gridCol w:w="742"/>
+        <w:gridCol w:w="9743"/>
       </w:tblGrid>
       <w:tr>
         <w:trPr>
@@ -627,7 +607,7 @@
         </w:trPr>
         <w:tc>
           <w:tcPr>
-            <w:tcW w:w="850" w:type="dxa"/>
+            <w:tcW w:w="742" w:type="dxa"/>
             <w:vAlign w:val="center"/>
             <w:hideMark/>
           </w:tcPr>
@@ -682,7 +662,7 @@
         </w:tc>
         <w:tc>
           <w:tcPr>
-            <w:tcW w:w="9635" w:type="dxa"/>
+            <w:tcW w:w="9743" w:type="dxa"/>
             <w:hideMark/>
           </w:tcPr>
           <w:tbl>
@@ -848,7 +828,7 @@
         </w:trPr>
         <w:tc>
           <w:tcPr>
-            <w:tcW w:w="850" w:type="dxa"/>
+            <w:tcW w:w="742" w:type="dxa"/>
             <w:vAlign w:val="center"/>
           </w:tcPr>
           <w:p>
@@ -880,7 +860,7 @@
         </w:tc>
         <w:tc>
           <w:tcPr>
-            <w:tcW w:w="9635" w:type="dxa"/>
+            <w:tcW w:w="9743" w:type="dxa"/>
             <w:vAlign w:val="center"/>
             <w:hideMark/>
           </w:tcPr>
@@ -903,7 +883,8 @@
         </w:trPr>
         <w:tc>
           <w:tcPr>
-            <w:tcW w:w="850" w:type="dxa"/>
+            <w:tcW w:w="10485" w:type="dxa"/>
+            <w:gridSpan w:val="2"/>
             <w:vAlign w:val="center"/>
           </w:tcPr>
           <w:p>
@@ -915,30 +896,6 @@
                 <w:lang w:val="es-ES"/>
               </w:rPr>
             </w:pPr>
-          </w:p>
-        </w:tc>
-        <w:tc>
-          <w:tcPr>
-            <w:tcW w:w="9635" w:type="dxa"/>
-            <w:vAlign w:val="center"/>
-          </w:tcPr>
-          <w:p>
-            <w:pPr>
-              <w:ind w:right="283"/>
-              <w:rPr>
-                <w:rFonts w:ascii="Arial" w:hAnsi="Arial" w:cs="Arial"/>
-                <w:sz w:val="24"/>
-                <w:lang w:val="es-ES"/>
-              </w:rPr>
-            </w:pPr>
-            <w:r>
-              <w:rPr>
-                <w:rFonts w:ascii="Arial" w:hAnsi="Arial" w:cs="Arial"/>
-                <w:sz w:val="24"/>
-                <w:lang w:val="es-ES"/>
-              </w:rPr>
-              <w:t xml:space="preserve"> </w:t>
-            </w:r>
             <w:proofErr w:type="spellStart"/>
             <w:r>
               <w:rPr>
@@ -992,75 +949,16 @@
       <w:proofErr w:type="spellEnd"/>
       <w:proofErr w:type="spellStart"/>
       <w:proofErr w:type="spellEnd"/>
-      <w:proofErr w:type="spellStart"/>
-      <w:proofErr w:type="spellEnd"/>
-      <w:proofErr w:type="spellStart"/>
-      <w:proofErr w:type="spellEnd"/>
-      <w:proofErr w:type="spellStart"/>
-      <w:proofErr w:type="spellEnd"/>
-      <w:proofErr w:type="spellStart"/>
-      <w:proofErr w:type="spellEnd"/>
-      <w:proofErr w:type="spellStart"/>
-      <w:proofErr w:type="spellEnd"/>
-      <w:proofErr w:type="spellStart"/>
-      <w:proofErr w:type="spellEnd"/>
-      <w:proofErr w:type="spellStart"/>
-      <w:proofErr w:type="spellEnd"/>
-      <w:proofErr w:type="spellStart"/>
-      <w:proofErr w:type="spellEnd"/>
-      <w:proofErr w:type="spellStart"/>
-      <w:proofErr w:type="spellEnd"/>
-      <w:proofErr w:type="spellStart"/>
-      <w:proofErr w:type="spellEnd"/>
-      <w:proofErr w:type="spellStart"/>
-      <w:proofErr w:type="spellEnd"/>
-      <w:proofErr w:type="spellStart"/>
-      <w:proofErr w:type="spellEnd"/>
-      <w:proofErr w:type="spellStart"/>
-      <w:proofErr w:type="spellEnd"/>
-      <w:proofErr w:type="spellStart"/>
-      <w:proofErr w:type="spellEnd"/>
-      <w:proofErr w:type="spellStart"/>
-      <w:proofErr w:type="spellEnd"/>
-      <w:proofErr w:type="spellStart"/>
-      <w:proofErr w:type="spellEnd"/>
-      <w:proofErr w:type="spellStart"/>
-      <w:proofErr w:type="spellEnd"/>
-      <w:proofErr w:type="spellStart"/>
-      <w:proofErr w:type="spellEnd"/>
-      <w:proofErr w:type="spellStart"/>
-      <w:proofErr w:type="spellEnd"/>
-      <w:proofErr w:type="spellStart"/>
-      <w:proofErr w:type="spellEnd"/>
-      <w:proofErr w:type="spellStart"/>
-      <w:proofErr w:type="spellEnd"/>
-      <w:proofErr w:type="spellStart"/>
-      <w:proofErr w:type="spellEnd"/>
-      <w:proofErr w:type="spellStart"/>
-      <w:proofErr w:type="spellEnd"/>
-      <w:proofErr w:type="spellStart"/>
-      <w:proofErr w:type="spellEnd"/>
-      <w:proofErr w:type="spellStart"/>
-      <w:proofErr w:type="spellEnd"/>
-      <w:proofErr w:type="spellStart"/>
-      <w:proofErr w:type="spellEnd"/>
-      <w:proofErr w:type="spellStart"/>
-      <w:proofErr w:type="spellEnd"/>
-      <w:proofErr w:type="spellStart"/>
-      <w:proofErr w:type="spellEnd"/>
-      <w:proofErr w:type="spellStart"/>
-      <w:proofErr w:type="spellEnd"/>
-      <w:proofErr w:type="spellStart"/>
       <w:proofErr w:type="gramStart"/>
-      <w:proofErr w:type="spellEnd"/>
       <w:proofErr w:type="gramEnd"/>
       <w:r>
         <w:rPr>
           <w:rFonts w:ascii="Arial" w:hAnsi="Arial"/>
-          <w:b w:val="0"/>
           <w:sz w:val="24"/>
-          <w:u w:val="none"/>
         </w:rPr>
+        <w:tab/>
+        <w:tab/>
+        <w:tab/>
         <w:t>Dalam rangka Mendampingi {{materi_tugas_pendamping}}, selama {{jumlah_angka}} ({{jumlah_teks}}) hari terhitung mulai Tanggal {{tanggal_mulai}} s/d Tanggal {{tanggal_akhir}}, maka dengan ini kami memohon kiranya dapat diberikan Izin keluar daerah kepada :</w:t>
       </w:r>
     </w:p>
@@ -1112,13 +1010,33 @@
       <w:r>
         <w:rPr>
           <w:rFonts w:ascii="Arial" w:hAnsi="Arial"/>
-          <w:b w:val="0"/>
           <w:sz w:val="24"/>
-          <w:u w:val="none"/>
+          <w:lang w:val="sv-SE"/>
         </w:rPr>
         <w:t>Nama</w:t>
+      </w:r>
+      <w:r>
+        <w:rPr>
+          <w:rFonts w:ascii="Arial" w:hAnsi="Arial"/>
+          <w:sz w:val="24"/>
+          <w:lang w:val="sv-SE"/>
+        </w:rPr>
         <w:tab/>
+      </w:r>
+      <w:r>
+        <w:rPr>
+          <w:rFonts w:ascii="Arial" w:hAnsi="Arial"/>
+          <w:sz w:val="24"/>
+          <w:lang w:val="sv-SE"/>
+        </w:rPr>
         <w:tab/>
+      </w:r>
+      <w:r>
+        <w:rPr>
+          <w:rFonts w:ascii="Arial" w:hAnsi="Arial"/>
+          <w:sz w:val="24"/>
+          <w:lang w:val="sv-SE"/>
+        </w:rPr>
         <w:tab/>
         <w:t xml:space="preserve">: </w:t>
       </w:r>
@@ -1127,7 +1045,7 @@
           <w:rFonts w:ascii="Arial" w:hAnsi="Arial"/>
           <w:b/>
           <w:sz w:val="24"/>
-          <w:u w:val="none"/>
+          <w:lang w:val="sv-SE"/>
         </w:rPr>
         <w:t>{{nama_asn}}</w:t>
       </w:r>
@@ -1152,22 +1070,34 @@
       <w:r>
         <w:rPr>
           <w:rFonts w:ascii="Arial" w:hAnsi="Arial"/>
-          <w:b w:val="0"/>
           <w:sz w:val="24"/>
-          <w:u w:val="none"/>
+          <w:lang w:val="sv-SE"/>
         </w:rPr>
         <w:t>Pangkat / Gol. Ruang</w:t>
-        <w:tab/>
-        <w:t xml:space="preserve">: </w:t>
       </w:r>
       <w:r>
         <w:rPr>
           <w:rFonts w:ascii="Arial" w:hAnsi="Arial"/>
-          <w:b w:val="0"/>
           <w:sz w:val="24"/>
-          <w:u w:val="none"/>
+          <w:lang w:val="sv-SE"/>
         </w:rPr>
-        <w:t>{{pangkat_asn}}</w:t>
+        <w:tab/>
+      </w:r>
+      <w:r>
+        <w:rPr>
+          <w:rFonts w:ascii="Arial" w:hAnsi="Arial"/>
+          <w:sz w:val="24"/>
+          <w:lang w:val="sv-SE"/>
+        </w:rPr>
+        <w:tab/>
+      </w:r>
+      <w:r>
+        <w:rPr>
+          <w:rFonts w:ascii="Arial" w:hAnsi="Arial"/>
+          <w:sz w:val="24"/>
+          <w:lang w:val="sv-SE"/>
+        </w:rPr>
+        <w:t>: {{pangkat_asn}}</w:t>
       </w:r>
     </w:p>
     <w:p>
@@ -1190,24 +1120,35 @@
       <w:r>
         <w:rPr>
           <w:rFonts w:ascii="Arial" w:hAnsi="Arial"/>
-          <w:b w:val="0"/>
           <w:sz w:val="24"/>
-          <w:u w:val="none"/>
+          <w:lang w:val="sv-SE"/>
         </w:rPr>
         <w:t>N I P</w:t>
-        <w:tab/>
-        <w:tab/>
-        <w:tab/>
-        <w:t xml:space="preserve">: </w:t>
       </w:r>
       <w:r>
         <w:rPr>
           <w:rFonts w:ascii="Arial" w:hAnsi="Arial"/>
-          <w:b w:val="0"/>
           <w:sz w:val="24"/>
-          <w:u w:val="none"/>
+          <w:lang w:val="sv-SE"/>
         </w:rPr>
-        <w:t>{{nip_asn}}</w:t>
+        <w:tab/>
+      </w:r>
+      <w:r>
+        <w:rPr>
+          <w:rFonts w:ascii="Arial" w:hAnsi="Arial"/>
+          <w:sz w:val="24"/>
+          <w:lang w:val="sv-SE"/>
+        </w:rPr>
+        <w:tab/>
+      </w:r>
+      <w:r>
+        <w:rPr>
+          <w:rFonts w:ascii="Arial" w:hAnsi="Arial"/>
+          <w:sz w:val="24"/>
+          <w:lang w:val="sv-SE"/>
+        </w:rPr>
+        <w:tab/>
+        <w:t>: {{nip_asn}}</w:t>
       </w:r>
     </w:p>
     <w:p>
@@ -1230,43 +1171,36 @@
       <w:r>
         <w:rPr>
           <w:rFonts w:ascii="Arial" w:hAnsi="Arial"/>
-          <w:b w:val="0"/>
           <w:sz w:val="24"/>
-          <w:u w:val="none"/>
+          <w:lang w:val="sv-SE"/>
         </w:rPr>
         <w:t>Jabatan</w:t>
-        <w:tab/>
-        <w:tab/>
-        <w:tab/>
-        <w:t xml:space="preserve">: </w:t>
       </w:r>
       <w:r>
         <w:rPr>
           <w:rFonts w:ascii="Arial" w:hAnsi="Arial"/>
-          <w:b w:val="0"/>
           <w:sz w:val="24"/>
-          <w:u w:val="none"/>
-        </w:rPr>
-        <w:t>{{jabatan_asn}}</w:t>
-      </w:r>
-    </w:p>
-    <w:p>
-      <w:pPr>
-        <w:tabs>
-          <w:tab w:val="left" w:pos="1418"/>
-          <w:tab w:val="left" w:pos="1701"/>
-          <w:tab w:val="left" w:pos="4253"/>
-        </w:tabs>
-        <w:spacing w:after="0" w:line="360" w:lineRule="auto"/>
-        <w:ind w:right="283"/>
-        <w:jc w:val="both"/>
-        <w:rPr>
-          <w:rFonts w:ascii="Arial" w:eastAsia="Times New Roman" w:hAnsi="Arial" w:cs="Arial"/>
-          <w:sz w:val="8"/>
-          <w:szCs w:val="24"/>
           <w:lang w:val="sv-SE"/>
         </w:rPr>
-      </w:pPr>
+        <w:tab/>
+      </w:r>
+      <w:r>
+        <w:rPr>
+          <w:rFonts w:ascii="Arial" w:hAnsi="Arial"/>
+          <w:sz w:val="24"/>
+          <w:lang w:val="sv-SE"/>
+        </w:rPr>
+        <w:tab/>
+      </w:r>
+      <w:r>
+        <w:rPr>
+          <w:rFonts w:ascii="Arial" w:hAnsi="Arial"/>
+          <w:sz w:val="24"/>
+          <w:lang w:val="sv-SE"/>
+        </w:rPr>
+        <w:tab/>
+        <w:t>: {{jabatan_asn}}</w:t>
+      </w:r>
     </w:p>
     <w:p>
       <w:pPr>
@@ -1275,7 +1209,7 @@
           <w:tab w:val="left" w:pos="9781"/>
         </w:tabs>
         <w:spacing w:after="0" w:line="360" w:lineRule="auto"/>
-        <w:ind w:left="709" w:right="283" w:firstLine="425"/>
+        <w:ind w:left="709" w:right="283" w:firstLine="709"/>
         <w:jc w:val="both"/>
         <w:rPr>
           <w:rFonts w:ascii="Arial" w:hAnsi="Arial" w:cs="Arial"/>
@@ -1291,25 +1225,17 @@
           <w:szCs w:val="24"/>
           <w:lang w:val="sv-SE"/>
         </w:rPr>
-        <w:t xml:space="preserve">Demikian permohonan ini kami sampaikan, atas perkenan dan bantuannya </w:t>
+        <w:t>Demikian permohonan ini kami sampaikan, atas perkenan dan bantuannya</w:t>
       </w:r>
-    </w:p>
-    <w:p>
-      <w:pPr>
-        <w:tabs>
-          <w:tab w:val="left" w:pos="709"/>
-          <w:tab w:val="left" w:pos="9781"/>
-        </w:tabs>
-        <w:spacing w:after="0" w:line="360" w:lineRule="auto"/>
-        <w:ind w:left="709" w:right="283" w:firstLine="425"/>
-        <w:jc w:val="both"/>
+      <w:r>
         <w:rPr>
           <w:rFonts w:ascii="Arial" w:hAnsi="Arial" w:cs="Arial"/>
           <w:sz w:val="24"/>
           <w:szCs w:val="24"/>
           <w:lang w:val="sv-SE"/>
         </w:rPr>
-      </w:pPr>
+        <w:t xml:space="preserve"> </w:t>
+      </w:r>
       <w:r>
         <w:rPr>
           <w:rFonts w:ascii="Arial" w:hAnsi="Arial" w:cs="Arial"/>
@@ -1358,7 +1284,7 @@
                 <wp:extent cx="3162300" cy="1535502"/>
                 <wp:effectExtent l="0" t="0" r="19050" b="26670"/>
                 <wp:wrapNone/>
-                <wp:docPr id="26" name="Text Box 26"/>
+                <wp:docPr id="1001" name="Text Box 26"/>
                 <wp:cNvGraphicFramePr>
                   <a:graphicFrameLocks xmlns:a="http://schemas.openxmlformats.org/drawingml/2006/main"/>
                 </wp:cNvGraphicFramePr>
@@ -1778,7 +1704,7 @@
                           <w:u w:val="single"/>
                           <w:lang w:val="sv-SE"/>
                         </w:rPr>
-                        <w:t>{{nama_ttd_asn}}</w:t>
+                        <w:t xml:space="preserve">{{nama_ttd_asn}}</w:t>
                       </w:r>
                     </w:p>
                     <w:p>
@@ -1799,7 +1725,7 @@
                           <w:szCs w:val="24"/>
                           <w:lang w:val="sv-SE"/>
                         </w:rPr>
-                        <w:t>{{pangkat_ttd_asn}}</w:t>
+                        <w:t xml:space="preserve">{{pangkat_ttd_asn}}</w:t>
                       </w:r>
                     </w:p>
                     <w:p>
@@ -1819,7 +1745,7 @@
                           <w:szCs w:val="24"/>
                           <w:lang w:val="sv-SE"/>
                         </w:rPr>
-                        <w:t>NIP. {{nip_ttd_asn}}</w:t>
+                        <w:t xml:space="preserve">NIP. {{nip_ttd_asn}}</w:t>
                       </w:r>
                     </w:p>
                     <w:p>
@@ -2039,8 +1965,13 @@
         </w:rPr>
       </w:pPr>
     </w:p>
-    <w:p/>
-    <w:p/>
+    <w:p>
+      <w:pPr>
+        <w:rPr>
+          <w:lang w:val="sv-SE"/>
+        </w:rPr>
+      </w:pPr>
+    </w:p>
     <w:sectPr>
       <w:headerReference w:type="default" r:id="rId8"/>
       <w:footerReference w:type="default" r:id="rId9"/>
@@ -2124,7 +2055,7 @@
 </file>
 
 <file path=word/header1.xml><?xml version="1.0" encoding="utf-8"?>
-<w:hdr xmlns:wpc="http://schemas.microsoft.com/office/word/2010/wordprocessingCanvas" xmlns:cx="http://schemas.microsoft.com/office/drawing/2014/chartex" xmlns:mc="http://schemas.openxmlformats.org/markup-compatibility/2006" xmlns:o="urn:schemas-microsoft-com:office:office" xmlns:r="http://schemas.openxmlformats.org/officeDocument/2006/relationships" xmlns:m="http://schemas.openxmlformats.org/officeDocument/2006/math" xmlns:v="urn:schemas-microsoft-com:vml" xmlns:wp14="http://schemas.microsoft.com/office/word/2010/wordprocessingDrawing" xmlns:wp="http://schemas.openxmlformats.org/drawingml/2006/wordprocessingDrawing" xmlns:w10="urn:schemas-microsoft-com:office:word" xmlns:w="http://schemas.openxmlformats.org/wordprocessingml/2006/main" xmlns:w14="http://schemas.microsoft.com/office/word/2010/wordml" xmlns:w15="http://schemas.microsoft.com/office/word/2012/wordml" xmlns:w16se="http://schemas.microsoft.com/office/word/2015/wordml/symex" xmlns:wpg="http://schemas.microsoft.com/office/word/2010/wordprocessingGroup" xmlns:wpi="http://schemas.microsoft.com/office/word/2010/wordprocessingInk" xmlns:wne="http://schemas.microsoft.com/office/word/2006/wordml" xmlns:wps="http://schemas.microsoft.com/office/word/2010/wordprocessingShape" mc:Ignorable="w14 w15 w16se wp14">
+<w:hdr xmlns:wpc="http://schemas.microsoft.com/office/word/2010/wordprocessingCanvas" xmlns:cx="http://schemas.microsoft.com/office/drawing/2014/chartex" xmlns:cx1="http://schemas.microsoft.com/office/drawing/2015/9/8/chartex" xmlns:cx2="http://schemas.microsoft.com/office/drawing/2015/10/21/chartex" xmlns:cx3="http://schemas.microsoft.com/office/drawing/2016/5/9/chartex" xmlns:cx4="http://schemas.microsoft.com/office/drawing/2016/5/10/chartex" xmlns:cx5="http://schemas.microsoft.com/office/drawing/2016/5/11/chartex" xmlns:cx6="http://schemas.microsoft.com/office/drawing/2016/5/12/chartex" xmlns:cx7="http://schemas.microsoft.com/office/drawing/2016/5/13/chartex" xmlns:cx8="http://schemas.microsoft.com/office/drawing/2016/5/14/chartex" xmlns:mc="http://schemas.openxmlformats.org/markup-compatibility/2006" xmlns:aink="http://schemas.microsoft.com/office/drawing/2016/ink" xmlns:am3d="http://schemas.microsoft.com/office/drawing/2017/model3d" xmlns:o="urn:schemas-microsoft-com:office:office" xmlns:oel="http://schemas.microsoft.com/office/2019/extlst" xmlns:r="http://schemas.openxmlformats.org/officeDocument/2006/relationships" xmlns:m="http://schemas.openxmlformats.org/officeDocument/2006/math" xmlns:v="urn:schemas-microsoft-com:vml" xmlns:wp14="http://schemas.microsoft.com/office/word/2010/wordprocessingDrawing" xmlns:wp="http://schemas.openxmlformats.org/drawingml/2006/wordprocessingDrawing" xmlns:w10="urn:schemas-microsoft-com:office:word" xmlns:w="http://schemas.openxmlformats.org/wordprocessingml/2006/main" xmlns:w14="http://schemas.microsoft.com/office/word/2010/wordml" xmlns:w15="http://schemas.microsoft.com/office/word/2012/wordml" xmlns:w16cex="http://schemas.microsoft.com/office/word/2018/wordml/cex" xmlns:w16cid="http://schemas.microsoft.com/office/word/2016/wordml/cid" xmlns:w16="http://schemas.microsoft.com/office/word/2018/wordml" xmlns:w16du="http://schemas.microsoft.com/office/word/2023/wordml/word16du" xmlns:w16sdtdh="http://schemas.microsoft.com/office/word/2020/wordml/sdtdatahash" xmlns:w16sdtfl="http://schemas.microsoft.com/office/word/2024/wordml/sdtformatlock" xmlns:w16se="http://schemas.microsoft.com/office/word/2015/wordml/symex" xmlns:wpg="http://schemas.microsoft.com/office/word/2010/wordprocessingGroup" xmlns:wpi="http://schemas.microsoft.com/office/word/2010/wordprocessingInk" xmlns:wne="http://schemas.microsoft.com/office/word/2006/wordml" xmlns:wps="http://schemas.microsoft.com/office/word/2010/wordprocessingShape" mc:Ignorable="w14 w15 w16se w16cid w16 w16cex w16sdtdh w16sdtfl w16du wp14">
   <w:p>
     <w:pPr>
       <w:tabs>
@@ -2329,7 +2260,7 @@
               <v:stroke joinstyle="miter"/>
               <v:path gradientshapeok="t" o:connecttype="rect"/>
             </v:shapetype>
-            <v:shape id="Text Box 757" o:spid="_x0000_s1026" type="#_x0000_t202" style="position:absolute;margin-left:101.45pt;margin-top:-1pt;width:373.5pt;height:91.1pt;z-index:251654656;visibility:visible;mso-wrap-style:square;mso-width-percent:0;mso-height-percent:0;mso-wrap-distance-left:9pt;mso-wrap-distance-top:0;mso-wrap-distance-right:9pt;mso-wrap-distance-bottom:0;mso-position-horizontal:absolute;mso-position-horizontal-relative:text;mso-position-vertical:absolute;mso-position-vertical-relative:text;mso-width-percent:0;mso-height-percent:0;mso-width-relative:margin;mso-height-relative:margin;v-text-anchor:top" o:gfxdata="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" filled="f" stroked="f">
+            <v:shape id="Text Box 757" o:spid="_x0000_s1027" type="#_x0000_t202" style="position:absolute;margin-left:101.45pt;margin-top:-1pt;width:373.5pt;height:91.1pt;z-index:251654656;visibility:visible;mso-wrap-style:square;mso-width-percent:0;mso-height-percent:0;mso-wrap-distance-left:9pt;mso-wrap-distance-top:0;mso-wrap-distance-right:9pt;mso-wrap-distance-bottom:0;mso-position-horizontal:absolute;mso-position-horizontal-relative:text;mso-position-vertical:absolute;mso-position-vertical-relative:text;mso-width-percent:0;mso-height-percent:0;mso-width-relative:margin;mso-height-relative:margin;v-text-anchor:top" o:gfxdata="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" filled="f" stroked="f">
               <v:textbox>
                 <w:txbxContent>
                   <w:p>

</xml_diff>